<commit_message>
day 4, openvla environment and integration with zivid
</commit_message>
<xml_diff>
--- a/OpenVLA_day04_openvla_integration.docx
+++ b/OpenVLA_day04_openvla_integration.docx
@@ -69,6 +69,14 @@
     </w:p>
     <w:p>
       <w:pPr>
+        <w:pStyle w:val="ListBullet"/>
+      </w:pPr>
+      <w:r>
+        <w:t>Poste d'installation OpenVLA : Windows 11 Pro (Anaconda / Conda, GPU NVIDIA).</w:t>
+      </w:r>
+    </w:p>
+    <w:p>
+      <w:pPr>
         <w:pStyle w:val="Heading1"/>
       </w:pPr>
       <w:r>
@@ -120,7 +128,7 @@
         <w:pStyle w:val="ListBullet"/>
       </w:pPr>
       <w:r>
-        <w:t>Installation prévue sur poste Linux avec GPU NVIDIA (VRAM selon précision FP16 / 8-bit / 4-bit).</w:t>
+        <w:t>Installation sur Windows 11 Pro avec GPU NVIDIA (VRAM selon précision FP16 / 8-bit / 4-bit).</w:t>
       </w:r>
     </w:p>
     <w:p>
@@ -128,7 +136,7 @@
         <w:pStyle w:val="ListBullet"/>
       </w:pPr>
       <w:r>
-        <w:t>Étapes principales : environnement Python dédié, PyTorch CUDA, dépôt openvla, dépendances, téléchargement des poids du modèle.</w:t>
+        <w:t>Étapes principales : Anaconda (Conda), environnement Python dédié (env_openvla), PyTorch CUDA, dépôt openvla, dépendances, téléchargement des poids du modèle.</w:t>
       </w:r>
     </w:p>
     <w:p>
@@ -136,7 +144,7 @@
         <w:pStyle w:val="ListBullet"/>
       </w:pPr>
       <w:r>
-        <w:t>Un environnement Conda env_openvla pourra être ajouté en complément de env_zivid, env_ur et env_integration.</w:t>
+        <w:t>Zivid SDK et ur-rtde restent compatibles Windows ; les environnements env_zivid, env_ur et env_integration coexistent avec env_openvla.</w:t>
       </w:r>
     </w:p>
     <w:p>
@@ -144,7 +152,7 @@
         <w:pStyle w:val="ListBullet"/>
       </w:pPr>
       <w:r>
-        <w:t>Les détails d'installation et les commandes seront documentés dans une mise à jour ultérieure de ce rapport.</w:t>
+        <w:t>Les détails d'installation et les commandes Windows seront documentés dans une mise à jour ultérieure de ce rapport.</w:t>
       </w:r>
     </w:p>
     <w:p>
@@ -232,7 +240,7 @@
         <w:pStyle w:val="ListBullet"/>
       </w:pPr>
       <w:r>
-        <w:t>Début de la mise en place de l'environnement OpenVLA.</w:t>
+        <w:t>Début de la mise en place de l'environnement OpenVLA sur Windows 11 Pro.</w:t>
       </w:r>
     </w:p>
     <w:p>
@@ -264,7 +272,7 @@
         <w:pStyle w:val="ListBullet"/>
       </w:pPr>
       <w:r>
-        <w:t>Finaliser l'installation OpenVLA et un premier test d'inférence.</w:t>
+        <w:t>Finaliser l'installation OpenVLA sous Windows 11 Pro et un premier test d'inférence.</w:t>
       </w:r>
     </w:p>
     <w:p>
@@ -286,9 +294,6 @@
     <w:p/>
     <w:p>
       <w:r>
-        <w:rPr>
-          <w:b w:val="0"/>
-        </w:rPr>
         <w:t>Programmeur : Fabrice Kouonang</w:t>
         <w:br/>
       </w:r>

</xml_diff>

<commit_message>
updating readme and day4.docx
</commit_message>
<xml_diff>
--- a/OpenVLA_day04_openvla_integration.docx
+++ b/OpenVLA_day04_openvla_integration.docx
@@ -32,7 +32,7 @@
         <w:pStyle w:val="ListBullet"/>
       </w:pPr>
       <w:r>
-        <w:t>Préparer l'environnement OpenVLA pour l'inférence vision-langage-action.</w:t>
+        <w:t>Installer et tester OpenVLA sur Windows 11 Pro (chargement du modèle + inférence).</w:t>
       </w:r>
     </w:p>
     <w:p>
@@ -40,7 +40,7 @@
         <w:pStyle w:val="ListBullet"/>
       </w:pPr>
       <w:r>
-        <w:t>Comprendre le mécanisme de communication entre le robot UR et la caméra Zivid dans le démonstrateur.</w:t>
+        <w:t>Relier perception (Zivid) et inférence (OpenVLA) dans une première pipeline de test.</w:t>
       </w:r>
     </w:p>
     <w:p>
@@ -56,7 +56,7 @@
         <w:pStyle w:val="ListBullet"/>
       </w:pPr>
       <w:r>
-        <w:t>Les jours précédents ont permis de maîtriser le robot UR (URScript) et l'API Zivid (acquisition 2D/3D). Le jour 04 marque le passage à l'intégration : relier perception (Zivid), intelligence (OpenVLA) et action (UR).</w:t>
+        <w:t>Poste : Windows 11 Pro, GPU NVIDIA, Anaconda (env_openvla).</w:t>
       </w:r>
     </w:p>
     <w:p>
@@ -64,7 +64,7 @@
         <w:pStyle w:val="ListBullet"/>
       </w:pPr>
       <w:r>
-        <w:t>L'environnement Conda env_integration (Python 3.10) sert de base pour les scripts combinés caméra + robot.</w:t>
+        <w:t>Modèle local : openvla-7b (Hugging Face, trust_remote_code=True).</w:t>
       </w:r>
     </w:p>
     <w:p>
@@ -72,7 +72,7 @@
         <w:pStyle w:val="ListBullet"/>
       </w:pPr>
       <w:r>
-        <w:t>Poste d'installation OpenVLA : Windows 11 Pro (Anaconda / Conda, GPU NVIDIA).</w:t>
+        <w:t>Les scripts de test se trouvent dans scripts/integration/test/.</w:t>
       </w:r>
     </w:p>
     <w:p>
@@ -96,7 +96,7 @@
         <w:pStyle w:val="ListBullet"/>
       </w:pPr>
       <w:r>
-        <w:t>Le script scripts/zivid/capture.py enregistre une image couleur (ColorImage.png), une frame 3D (Frame.zdf) et un nuage de points (PointCloud.ply).</w:t>
+        <w:t>Image couleur sauvegardée (capture.png), puis convertie RGBA → RGB pour OpenVLA.</w:t>
       </w:r>
     </w:p>
     <w:p>
@@ -104,7 +104,7 @@
         <w:pStyle w:val="ListBullet"/>
       </w:pPr>
       <w:r>
-        <w:t>La connexion Ethernet et les réglages d'acquisition sont validés — prérequis pour alimenter OpenVLA.</w:t>
+        <w:t>Redimensionnement à 224×224 px (format attendu par le modèle).</w:t>
       </w:r>
     </w:p>
     <w:p>
@@ -112,7 +112,7 @@
         <w:pStyle w:val="Heading1"/>
       </w:pPr>
       <w:r>
-        <w:t>Environnement OpenVLA (vue d'ensemble)</w:t>
+        <w:t>Environnement OpenVLA — essentiels</w:t>
       </w:r>
     </w:p>
     <w:p>
@@ -120,7 +120,7 @@
         <w:pStyle w:val="ListBullet"/>
       </w:pPr>
       <w:r>
-        <w:t>OpenVLA est un modèle vision-langage-action : il prend une image et une consigne textuelle, puis produit des actions robotiques.</w:t>
+        <w:t>Packages principaux : transformers, torch, Pillow, zivid, numpy.</w:t>
       </w:r>
     </w:p>
     <w:p>
@@ -128,7 +128,7 @@
         <w:pStyle w:val="ListBullet"/>
       </w:pPr>
       <w:r>
-        <w:t>Installation sur Windows 11 Pro avec GPU NVIDIA (VRAM selon précision FP16 / 8-bit / 4-bit).</w:t>
+        <w:t>Modèle : AutoModelForVision2Seq + AutoProcessor (openvla-7b).</w:t>
       </w:r>
     </w:p>
     <w:p>
@@ -136,7 +136,7 @@
         <w:pStyle w:val="ListBullet"/>
       </w:pPr>
       <w:r>
-        <w:t>Étapes principales : Anaconda (Conda), environnement Python dédié (env_openvla), PyTorch CUDA, dépôt openvla, dépendances, téléchargement des poids du modèle.</w:t>
+        <w:t>Précision : float16 ou bfloat16 sur CUDA.</w:t>
       </w:r>
     </w:p>
     <w:p>
@@ -144,7 +144,15 @@
         <w:pStyle w:val="ListBullet"/>
       </w:pPr>
       <w:r>
-        <w:t>Zivid SDK et ur-rtde restent compatibles Windows ; les environnements env_zivid, env_ur et env_integration coexistent avec env_openvla.</w:t>
+        <w:t>Test de chargement (test_openvla.py) : vérifier processor, modèle et VRAM GPU.</w:t>
+      </w:r>
+    </w:p>
+    <w:p>
+      <w:pPr>
+        <w:pStyle w:val="Heading1"/>
+      </w:pPr>
+      <w:r>
+        <w:t>Pipeline Zivid → OpenVLA — essentiels</w:t>
       </w:r>
     </w:p>
     <w:p>
@@ -152,7 +160,47 @@
         <w:pStyle w:val="ListBullet"/>
       </w:pPr>
       <w:r>
-        <w:t>Les détails d'installation et les commandes Windows seront documentés dans une mise à jour ultérieure de ce rapport.</w:t>
+        <w:t>1. Connexion caméra Zivid et capture 2D/3D.</w:t>
+      </w:r>
+    </w:p>
+    <w:p>
+      <w:pPr>
+        <w:pStyle w:val="ListBullet"/>
+      </w:pPr>
+      <w:r>
+        <w:t>2. Export image couleur, conversion RGBA → RGB, resize 224×224.</w:t>
+      </w:r>
+    </w:p>
+    <w:p>
+      <w:pPr>
+        <w:pStyle w:val="ListBullet"/>
+      </w:pPr>
+      <w:r>
+        <w:t>3. Chargement OpenVLA sur GPU (cuda:0).</w:t>
+      </w:r>
+    </w:p>
+    <w:p>
+      <w:pPr>
+        <w:pStyle w:val="ListBullet"/>
+      </w:pPr>
+      <w:r>
+        <w:t>4. Consigne texte → prompt : « What action should the robot take to … ? »</w:t>
+      </w:r>
+    </w:p>
+    <w:p>
+      <w:pPr>
+        <w:pStyle w:val="ListBullet"/>
+      </w:pPr>
+      <w:r>
+        <w:t>5. predict_action → sortie 7 valeurs : dx, dy, dz, rx, ry, rz, pince.</w:t>
+      </w:r>
+    </w:p>
+    <w:p>
+      <w:pPr>
+        <w:pStyle w:val="ListBullet"/>
+      </w:pPr>
+      <w:r>
+        <w:t>6. Instructions testées : pick up, grab red object, push left, place in bin.</w:t>
       </w:r>
     </w:p>
     <w:p>
@@ -168,7 +216,7 @@
         <w:pStyle w:val="ListBullet"/>
       </w:pPr>
       <w:r>
-        <w:t>Les deux périphériques sont pilotés depuis Python, sans lien direct matériel entre eux.</w:t>
+        <w:t>Zivid et UR sont pilotés en Python, sans lien matériel direct.</w:t>
       </w:r>
     </w:p>
     <w:p>
@@ -176,7 +224,7 @@
         <w:pStyle w:val="ListBullet"/>
       </w:pPr>
       <w:r>
-        <w:t>Zivid (SDK Python) : connexion caméra, capture 2D/3D, export image / nuage de points.</w:t>
+        <w:t>Zivid (SDK) : capture image / nuage de points.</w:t>
       </w:r>
     </w:p>
     <w:p>
@@ -184,7 +232,7 @@
         <w:pStyle w:val="ListBullet"/>
       </w:pPr>
       <w:r>
-        <w:t>UR (ur-rtde) : connexion RTDE sur le réseau, lecture de l'état du robot, envoi de mouvements.</w:t>
+        <w:t>UR (ur-rtde) : état robot et commandes de mouvement.</w:t>
       </w:r>
     </w:p>
     <w:p>
@@ -192,7 +240,7 @@
         <w:pStyle w:val="ListBullet"/>
       </w:pPr>
       <w:r>
-        <w:t>Le script d'intégration (scripts/integration/zivid_ur_robot_integration.py) orchestrera la séquence : capture → traitement / inférence → commande robot.</w:t>
+        <w:t>Schéma cible : Zivid → image RGB → OpenVLA → actions → Robot UR via RTDE.</w:t>
       </w:r>
     </w:p>
     <w:p>
@@ -200,7 +248,15 @@
         <w:pStyle w:val="ListBullet"/>
       </w:pPr>
       <w:r>
-        <w:t>Schéma logique : Caméra Zivid → image RGB → OpenVLA → actions → Robot UR via RTDE.</w:t>
+        <w:t>Script d'intégration complet : scripts/integration/zivid_ur_robot_integration.py (à venir).</w:t>
+      </w:r>
+    </w:p>
+    <w:p>
+      <w:pPr>
+        <w:pStyle w:val="Heading1"/>
+      </w:pPr>
+      <w:r>
+        <w:t>Scripts de test</w:t>
       </w:r>
     </w:p>
     <w:p>
@@ -208,7 +264,23 @@
         <w:pStyle w:val="ListBullet"/>
       </w:pPr>
       <w:r>
-        <w:t>Les programmes URScript (.script) restent utilisables sur PolyScope pour des mouvements prédéfinis ; l'intégration Python complète la boucle perception-action.</w:t>
+        <w:t>scripts/integration/test/test_openvla.py — chargement modèle et vérification VRAM.</w:t>
+      </w:r>
+    </w:p>
+    <w:p>
+      <w:pPr>
+        <w:pStyle w:val="ListBullet"/>
+      </w:pPr>
+      <w:r>
+        <w:t>scripts/integration/test/test_zivid_openvla.py — capture Zivid + inférence OpenVLA.</w:t>
+      </w:r>
+    </w:p>
+    <w:p>
+      <w:pPr>
+        <w:pStyle w:val="ListBullet"/>
+      </w:pPr>
+      <w:r>
+        <w:t>scripts/utils.txt — notes utilitaires (chemins, commandes, rappels).</w:t>
       </w:r>
     </w:p>
     <w:p>
@@ -224,7 +296,7 @@
         <w:pStyle w:val="ListBullet"/>
       </w:pPr>
       <w:r>
-        <w:t>Test de capture caméra validé.</w:t>
+        <w:t>Capture caméra validée.</w:t>
       </w:r>
     </w:p>
     <w:p>
@@ -232,7 +304,7 @@
         <w:pStyle w:val="ListBullet"/>
       </w:pPr>
       <w:r>
-        <w:t>Compréhension du schéma d'intégration UR + Zivid + OpenVLA.</w:t>
+        <w:t>Modèle OpenVLA chargé et testé sur GPU.</w:t>
       </w:r>
     </w:p>
     <w:p>
@@ -240,7 +312,7 @@
         <w:pStyle w:val="ListBullet"/>
       </w:pPr>
       <w:r>
-        <w:t>Début de la mise en place de l'environnement OpenVLA sur Windows 11 Pro.</w:t>
+        <w:t>Première inférence Zivid + OpenVLA (actions prédites à partir d'une consigne).</w:t>
       </w:r>
     </w:p>
     <w:p>
@@ -248,15 +320,7 @@
         <w:pStyle w:val="ListBullet"/>
       </w:pPr>
       <w:r>
-        <w:t>Rapport : OpenVLA_day04_openvla_integration.docx (version initiale, à enrichir).</w:t>
-      </w:r>
-    </w:p>
-    <w:p>
-      <w:pPr>
-        <w:pStyle w:val="ListBullet"/>
-      </w:pPr>
-      <w:r>
-        <w:t>Script d'intégration : scripts/integration/zivid_ur_robot_integration.py (placeholder).</w:t>
+        <w:t>Rapport et README mis à jour.</w:t>
       </w:r>
     </w:p>
     <w:p>
@@ -272,7 +336,7 @@
         <w:pStyle w:val="ListBullet"/>
       </w:pPr>
       <w:r>
-        <w:t>Finaliser l'installation OpenVLA sous Windows 11 Pro et un premier test d'inférence.</w:t>
+        <w:t>Connecter les actions OpenVLA au robot UR (ur-rtde).</w:t>
       </w:r>
     </w:p>
     <w:p>
@@ -280,7 +344,7 @@
         <w:pStyle w:val="ListBullet"/>
       </w:pPr>
       <w:r>
-        <w:t>Implémenter le script d'intégration (capture Zivid + commande UR).</w:t>
+        <w:t>Finaliser zivid_ur_robot_integration.py.</w:t>
       </w:r>
     </w:p>
     <w:p>
@@ -288,7 +352,7 @@
         <w:pStyle w:val="ListBullet"/>
       </w:pPr>
       <w:r>
-        <w:t>Documenter le code et les résultats expérimentaux dans ce rapport.</w:t>
+        <w:t>Documenter résultats expérimentaux et ajuster les consignes.</w:t>
       </w:r>
     </w:p>
     <w:p/>

</xml_diff>